<commit_message>
added ,trail selection,without changing logic ...upload[file 1,2,3]
</commit_message>
<xml_diff>
--- a/PII-Detection/outputs/redacted1.docx
+++ b/PII-Detection/outputs/redacted1.docx
@@ -23,7 +23,7 @@
           <w:i/>
           <w:sz w:val="22"/>
         </w:rPr>
-        <w:t>Confidential Information — PII Redaction Test</w:t>
+        <w:t>&lt;ORGANIZATION&gt; — PII Redaction Test</w:t>
       </w:r>
     </w:p>
     <w:p/>
@@ -63,10 +63,10 @@
         <w:rPr>
           <w:b/>
         </w:rPr>
-        <w:t xml:space="preserve">&lt;PERSON&gt;: </w:t>
+        <w:t xml:space="preserve">Email: </w:t>
       </w:r>
       <w:r>
-        <w:t>&lt;URL&gt;DDRESS&gt;</w:t>
+        <w:t>&lt;EMAIL_ADDRESS&gt;</w:t>
       </w:r>
     </w:p>
     <w:p>
@@ -77,7 +77,7 @@
         <w:t xml:space="preserve">Phone: </w:t>
       </w:r>
       <w:r>
-        <w:t>&lt;PHONE_NUMBER&gt;</w:t>
+        <w:t>+91 &lt;DATE_TIME&gt;</w:t>
       </w:r>
     </w:p>
     <w:p>
@@ -91,15 +91,15 @@
     </w:p>
     <w:p>
       <w:r>
-        <w:t>24, &lt;LOCATION&gt;</w:t>
+        <w:t>24, Lake View Road</w:t>
         <w:br/>
       </w:r>
       <w:r>
-        <w:t>&lt;LOCATION&gt;</w:t>
+        <w:t>Anna Nagar</w:t>
         <w:br/>
       </w:r>
       <w:r>
-        <w:t>&lt;LOCATION&gt;, Tamil Nadu &lt;US_DRIVER_LICENSE&gt;</w:t>
+        <w:t>Chennai, &lt;PERSON&gt;</w:t>
         <w:br/>
       </w:r>
       <w:r>
@@ -186,7 +186,7 @@
           </w:tcPr>
           <w:p>
             <w:r>
-              <w:t>PAN</w:t>
+              <w:t>&lt;ORGANIZATION&gt;</w:t>
             </w:r>
           </w:p>
         </w:tc>
@@ -197,7 +197,7 @@
           </w:tcPr>
           <w:p>
             <w:r>
-              <w:t>&lt;PERSON&gt;</w:t>
+              <w:t>ABCDE1234F</w:t>
             </w:r>
           </w:p>
         </w:tc>
@@ -210,7 +210,7 @@
           </w:tcPr>
           <w:p>
             <w:r>
-              <w:t>Aadhaar</w:t>
+              <w:t>&lt;ORGANIZATION&gt;</w:t>
             </w:r>
           </w:p>
         </w:tc>
@@ -221,7 +221,7 @@
           </w:tcPr>
           <w:p>
             <w:r>
-              <w:t>4521 7836 9012</w:t>
+              <w:t>4521 7836 &lt;DATE_TIME&gt;</w:t>
             </w:r>
           </w:p>
         </w:tc>
@@ -269,7 +269,7 @@
         <w:rPr>
           <w:i/>
         </w:rPr>
-        <w:t>&lt;URL&gt;DDRESS&gt;</w:t>
+        <w:t>&lt;EMAIL_ADDRESS&gt;</w:t>
       </w:r>
     </w:p>
     <w:p>
@@ -381,7 +381,7 @@
           </w:tcPr>
           <w:p>
             <w:r>
-              <w:t>&lt;PHONE_NUMBER&gt;</w:t>
+              <w:t>+91 &lt;DATE_TIME&gt;</w:t>
             </w:r>
           </w:p>
         </w:tc>
@@ -403,7 +403,7 @@
           </w:tcPr>
           <w:p>
             <w:r>
-              <w:t>&lt;URL&gt;DDRESS&gt;</w:t>
+              <w:t>&lt;EMAIL_ADDRESS&gt;</w:t>
             </w:r>
           </w:p>
         </w:tc>
@@ -415,7 +415,7 @@
           <w:b/>
           <w:sz w:val="28"/>
         </w:rPr>
-        <w:t>Financial Information</w:t>
+        <w:t>&lt;ORGANIZATION&gt;</w:t>
       </w:r>
     </w:p>
     <w:p>
@@ -429,7 +429,7 @@
         <w:rPr>
           <w:u w:val="single"/>
         </w:rPr>
-        <w:t>&lt;US_DRIVER_LICENSE&gt;BER&gt;</w:t>
+        <w:t>&lt;DATE_TIME&gt;</w:t>
       </w:r>
     </w:p>
     <w:p>
@@ -457,7 +457,7 @@
     </w:p>
     <w:p>
       <w:r>
-        <w:t>&lt;PERSON&gt; currently lives in &lt;LOCATION&gt; and can be contacted at &lt;URL&gt;DDRESS&gt;&lt;PHONE_NUMBER&gt;. This document contains intentionally fictional information for testing PII detection and redaction.</w:t>
+        <w:t>Arjun currently lives in &lt;ORGANIZATION&gt; and can be contacted at &lt;EMAIL_ADDRESS&gt; or +91 &lt;DATE_TIME&gt;. This document contains intentionally fictional information for testing &lt;ORGANIZATION&gt; detection and redaction.</w:t>
       </w:r>
     </w:p>
     <w:sectPr>

</xml_diff>